<commit_message>
Integra elementos formales USC para depósito EDIUS
</commit_message>
<xml_diff>
--- a/docs/edius/modelos/portada_interna_usc.docx
+++ b/docs/edius/modelos/portada_interna_usc.docx
@@ -101,34 +101,25 @@
           <w:szCs w:val="40"/>
         </w:rPr>
       </w:pPr>
-      <w:bookmarkStart w:id="0" w:name="_GoBack"/>
-      <w:bookmarkEnd w:id="0"/>
       <w:r>
         <w:rPr>
           <w:rFonts w:ascii="Lucida" w:hAnsi="Lucida"/>
           <w:sz w:val="40"/>
           <w:szCs w:val="40"/>
         </w:rPr>
-        <w:t xml:space="preserve"> </w:t>
-      </w:r>
-      <w:r>
+        <w:t>José Vicente Ordóñez Yaguache</w:t>
+      </w:r>
+    </w:p>
+    <w:p>
+      <w:pPr>
+        <w:spacing w:line="240" w:lineRule="auto"/>
+        <w:jc w:val="center"/>
         <w:rPr>
           <w:rFonts w:ascii="Lucida" w:hAnsi="Lucida"/>
           <w:sz w:val="40"/>
           <w:szCs w:val="40"/>
         </w:rPr>
-        <w:t xml:space="preserve">José Vicente Ordóñez </w:t>
-      </w:r>
-      <w:proofErr w:type="spellStart"/>
-      <w:r>
-        <w:rPr>
-          <w:rFonts w:ascii="Lucida" w:hAnsi="Lucida"/>
-          <w:sz w:val="40"/>
-          <w:szCs w:val="40"/>
-        </w:rPr>
-        <w:t>Yaguache</w:t>
-      </w:r>
-      <w:proofErr w:type="spellEnd"/>
+      </w:pPr>
     </w:p>
     <w:p>
       <w:pPr>
@@ -141,18 +132,15 @@
           <w:szCs w:val="20"/>
         </w:rPr>
       </w:pPr>
-    </w:p>
-    <w:p>
-      <w:pPr>
-        <w:spacing w:line="240" w:lineRule="auto"/>
-        <w:jc w:val="center"/>
+      <w:r>
         <w:rPr>
           <w:rFonts w:ascii="Lucida" w:hAnsi="Lucida"/>
           <w:b/>
           <w:sz w:val="20"/>
           <w:szCs w:val="20"/>
         </w:rPr>
-      </w:pPr>
+        <w:t>ESC</w:t>
+      </w:r>
       <w:r>
         <w:rPr>
           <w:rFonts w:ascii="Lucida" w:hAnsi="Lucida"/>
@@ -160,7 +148,7 @@
           <w:sz w:val="20"/>
           <w:szCs w:val="20"/>
         </w:rPr>
-        <w:t>ESC</w:t>
+        <w:t>UE</w:t>
       </w:r>
       <w:r>
         <w:rPr>
@@ -169,7 +157,7 @@
           <w:sz w:val="20"/>
           <w:szCs w:val="20"/>
         </w:rPr>
-        <w:t>UE</w:t>
+        <w:t>LA DE DO</w:t>
       </w:r>
       <w:r>
         <w:rPr>
@@ -178,7 +166,7 @@
           <w:sz w:val="20"/>
           <w:szCs w:val="20"/>
         </w:rPr>
-        <w:t>LA DE DO</w:t>
+        <w:t>CTORADO</w:t>
       </w:r>
       <w:r>
         <w:rPr>
@@ -187,65 +175,29 @@
           <w:sz w:val="20"/>
           <w:szCs w:val="20"/>
         </w:rPr>
-        <w:t>CTORADO</w:t>
-      </w:r>
-      <w:r>
+        <w:t xml:space="preserve"> INTERNACIONAL DE LA UNIVERSIDAD DE SANTIAGO DE COMPOSTELA</w:t>
+      </w:r>
+    </w:p>
+    <w:p>
+      <w:pPr>
+        <w:spacing w:line="240" w:lineRule="auto"/>
+        <w:ind w:firstLine="708"/>
+        <w:jc w:val="center"/>
         <w:rPr>
           <w:rFonts w:ascii="Lucida" w:hAnsi="Lucida"/>
           <w:b/>
           <w:sz w:val="20"/>
           <w:szCs w:val="20"/>
         </w:rPr>
-        <w:t xml:space="preserve"> INTERNACIONAL DE LA UNIVERSIDAD DE SANTIAGO DE COMPOSTELA</w:t>
-      </w:r>
-    </w:p>
-    <w:p>
-      <w:pPr>
-        <w:spacing w:line="240" w:lineRule="auto"/>
-        <w:ind w:firstLine="708"/>
-        <w:jc w:val="center"/>
+      </w:pPr>
+      <w:r>
         <w:rPr>
           <w:rFonts w:ascii="Lucida" w:hAnsi="Lucida"/>
           <w:b/>
           <w:sz w:val="20"/>
           <w:szCs w:val="20"/>
         </w:rPr>
-      </w:pPr>
-      <w:r>
-        <w:rPr>
-          <w:rFonts w:ascii="Lucida" w:hAnsi="Lucida"/>
-          <w:b/>
-          <w:sz w:val="20"/>
-          <w:szCs w:val="20"/>
-        </w:rPr>
-        <w:t>PROGRAMA DE DO</w:t>
-      </w:r>
-      <w:r>
-        <w:rPr>
-          <w:rFonts w:ascii="Lucida" w:hAnsi="Lucida"/>
-          <w:b/>
-          <w:sz w:val="20"/>
-          <w:szCs w:val="20"/>
-        </w:rPr>
-        <w:t>CTORADO</w:t>
-      </w:r>
-      <w:r>
-        <w:rPr>
-          <w:rFonts w:ascii="Lucida" w:hAnsi="Lucida"/>
-          <w:b/>
-          <w:sz w:val="20"/>
-          <w:szCs w:val="20"/>
-        </w:rPr>
-        <w:t xml:space="preserve"> </w:t>
-      </w:r>
-      <w:r>
-        <w:rPr>
-          <w:rFonts w:ascii="Lucida" w:hAnsi="Lucida"/>
-          <w:b/>
-          <w:sz w:val="20"/>
-          <w:szCs w:val="20"/>
-        </w:rPr>
-        <w:t>EN GESTIÓN SOSTENIBLE DE LA TIERRA Y DEL TERRITORIO</w:t>
+        <w:t>PROGRAMA DE DOCTORADO EN GESTIÓN SOSTENIBLE DE LA TIERRA Y DEL TERRITORIO</w:t>
       </w:r>
     </w:p>
     <w:p>
@@ -302,7 +254,12 @@
       </w:r>
     </w:p>
     <w:sectPr>
-      <w:headerReference w:type="default" r:id="rId6"/>
+      <w:headerReference w:type="even" r:id="rId6"/>
+      <w:headerReference w:type="default" r:id="rId7"/>
+      <w:footerReference w:type="even" r:id="rId8"/>
+      <w:footerReference w:type="default" r:id="rId9"/>
+      <w:headerReference w:type="first" r:id="rId10"/>
+      <w:footerReference w:type="first" r:id="rId11"/>
       <w:pgSz w:w="11906" w:h="16838"/>
       <w:pgMar w:top="851" w:right="851" w:bottom="567" w:left="851" w:header="709" w:footer="709" w:gutter="0"/>
       <w:cols w:space="708"/>
@@ -337,6 +294,36 @@
 </w:endnotes>
 </file>
 
+<file path=word/footer1.xml><?xml version="1.0" encoding="utf-8"?>
+<w:ftr xmlns:wpc="http://schemas.microsoft.com/office/word/2010/wordprocessingCanvas" xmlns:cx="http://schemas.microsoft.com/office/drawing/2014/chartex" xmlns:cx1="http://schemas.microsoft.com/office/drawing/2015/9/8/chartex" xmlns:cx2="http://schemas.microsoft.com/office/drawing/2015/10/21/chartex" xmlns:cx3="http://schemas.microsoft.com/office/drawing/2016/5/9/chartex" xmlns:cx4="http://schemas.microsoft.com/office/drawing/2016/5/10/chartex" xmlns:cx5="http://schemas.microsoft.com/office/drawing/2016/5/11/chartex" xmlns:cx6="http://schemas.microsoft.com/office/drawing/2016/5/12/chartex" xmlns:cx7="http://schemas.microsoft.com/office/drawing/2016/5/13/chartex" xmlns:cx8="http://schemas.microsoft.com/office/drawing/2016/5/14/chartex" xmlns:mc="http://schemas.openxmlformats.org/markup-compatibility/2006" xmlns:aink="http://schemas.microsoft.com/office/drawing/2016/ink" xmlns:am3d="http://schemas.microsoft.com/office/drawing/2017/model3d" xmlns:o="urn:schemas-microsoft-com:office:office" xmlns:r="http://schemas.openxmlformats.org/officeDocument/2006/relationships" xmlns:m="http://schemas.openxmlformats.org/officeDocument/2006/math" xmlns:v="urn:schemas-microsoft-com:vml" xmlns:wp14="http://schemas.microsoft.com/office/word/2010/wordprocessingDrawing" xmlns:wp="http://schemas.openxmlformats.org/drawingml/2006/wordprocessingDrawing" xmlns:w10="urn:schemas-microsoft-com:office:word" xmlns:w="http://schemas.openxmlformats.org/wordprocessingml/2006/main" xmlns:w14="http://schemas.microsoft.com/office/word/2010/wordml" xmlns:w15="http://schemas.microsoft.com/office/word/2012/wordml" xmlns:w16cid="http://schemas.microsoft.com/office/word/2016/wordml/cid" xmlns:w16se="http://schemas.microsoft.com/office/word/2015/wordml/symex" xmlns:wpg="http://schemas.microsoft.com/office/word/2010/wordprocessingGroup" xmlns:wpi="http://schemas.microsoft.com/office/word/2010/wordprocessingInk" xmlns:wne="http://schemas.microsoft.com/office/word/2006/wordml" xmlns:wps="http://schemas.microsoft.com/office/word/2010/wordprocessingShape" mc:Ignorable="w14 w15 w16se w16cid wp14">
+  <w:p>
+    <w:pPr>
+      <w:pStyle w:val="Piedepgina"/>
+    </w:pPr>
+  </w:p>
+</w:ftr>
+</file>
+
+<file path=word/footer2.xml><?xml version="1.0" encoding="utf-8"?>
+<w:ftr xmlns:wpc="http://schemas.microsoft.com/office/word/2010/wordprocessingCanvas" xmlns:cx="http://schemas.microsoft.com/office/drawing/2014/chartex" xmlns:cx1="http://schemas.microsoft.com/office/drawing/2015/9/8/chartex" xmlns:cx2="http://schemas.microsoft.com/office/drawing/2015/10/21/chartex" xmlns:cx3="http://schemas.microsoft.com/office/drawing/2016/5/9/chartex" xmlns:cx4="http://schemas.microsoft.com/office/drawing/2016/5/10/chartex" xmlns:cx5="http://schemas.microsoft.com/office/drawing/2016/5/11/chartex" xmlns:cx6="http://schemas.microsoft.com/office/drawing/2016/5/12/chartex" xmlns:cx7="http://schemas.microsoft.com/office/drawing/2016/5/13/chartex" xmlns:cx8="http://schemas.microsoft.com/office/drawing/2016/5/14/chartex" xmlns:mc="http://schemas.openxmlformats.org/markup-compatibility/2006" xmlns:aink="http://schemas.microsoft.com/office/drawing/2016/ink" xmlns:am3d="http://schemas.microsoft.com/office/drawing/2017/model3d" xmlns:o="urn:schemas-microsoft-com:office:office" xmlns:r="http://schemas.openxmlformats.org/officeDocument/2006/relationships" xmlns:m="http://schemas.openxmlformats.org/officeDocument/2006/math" xmlns:v="urn:schemas-microsoft-com:vml" xmlns:wp14="http://schemas.microsoft.com/office/word/2010/wordprocessingDrawing" xmlns:wp="http://schemas.openxmlformats.org/drawingml/2006/wordprocessingDrawing" xmlns:w10="urn:schemas-microsoft-com:office:word" xmlns:w="http://schemas.openxmlformats.org/wordprocessingml/2006/main" xmlns:w14="http://schemas.microsoft.com/office/word/2010/wordml" xmlns:w15="http://schemas.microsoft.com/office/word/2012/wordml" xmlns:w16cid="http://schemas.microsoft.com/office/word/2016/wordml/cid" xmlns:w16se="http://schemas.microsoft.com/office/word/2015/wordml/symex" xmlns:wpg="http://schemas.microsoft.com/office/word/2010/wordprocessingGroup" xmlns:wpi="http://schemas.microsoft.com/office/word/2010/wordprocessingInk" xmlns:wne="http://schemas.microsoft.com/office/word/2006/wordml" xmlns:wps="http://schemas.microsoft.com/office/word/2010/wordprocessingShape" mc:Ignorable="w14 w15 w16se w16cid wp14">
+  <w:p>
+    <w:pPr>
+      <w:pStyle w:val="Piedepgina"/>
+    </w:pPr>
+  </w:p>
+</w:ftr>
+</file>
+
+<file path=word/footer3.xml><?xml version="1.0" encoding="utf-8"?>
+<w:ftr xmlns:wpc="http://schemas.microsoft.com/office/word/2010/wordprocessingCanvas" xmlns:cx="http://schemas.microsoft.com/office/drawing/2014/chartex" xmlns:cx1="http://schemas.microsoft.com/office/drawing/2015/9/8/chartex" xmlns:cx2="http://schemas.microsoft.com/office/drawing/2015/10/21/chartex" xmlns:cx3="http://schemas.microsoft.com/office/drawing/2016/5/9/chartex" xmlns:cx4="http://schemas.microsoft.com/office/drawing/2016/5/10/chartex" xmlns:cx5="http://schemas.microsoft.com/office/drawing/2016/5/11/chartex" xmlns:cx6="http://schemas.microsoft.com/office/drawing/2016/5/12/chartex" xmlns:cx7="http://schemas.microsoft.com/office/drawing/2016/5/13/chartex" xmlns:cx8="http://schemas.microsoft.com/office/drawing/2016/5/14/chartex" xmlns:mc="http://schemas.openxmlformats.org/markup-compatibility/2006" xmlns:aink="http://schemas.microsoft.com/office/drawing/2016/ink" xmlns:am3d="http://schemas.microsoft.com/office/drawing/2017/model3d" xmlns:o="urn:schemas-microsoft-com:office:office" xmlns:r="http://schemas.openxmlformats.org/officeDocument/2006/relationships" xmlns:m="http://schemas.openxmlformats.org/officeDocument/2006/math" xmlns:v="urn:schemas-microsoft-com:vml" xmlns:wp14="http://schemas.microsoft.com/office/word/2010/wordprocessingDrawing" xmlns:wp="http://schemas.openxmlformats.org/drawingml/2006/wordprocessingDrawing" xmlns:w10="urn:schemas-microsoft-com:office:word" xmlns:w="http://schemas.openxmlformats.org/wordprocessingml/2006/main" xmlns:w14="http://schemas.microsoft.com/office/word/2010/wordml" xmlns:w15="http://schemas.microsoft.com/office/word/2012/wordml" xmlns:w16cid="http://schemas.microsoft.com/office/word/2016/wordml/cid" xmlns:w16se="http://schemas.microsoft.com/office/word/2015/wordml/symex" xmlns:wpg="http://schemas.microsoft.com/office/word/2010/wordprocessingGroup" xmlns:wpi="http://schemas.microsoft.com/office/word/2010/wordprocessingInk" xmlns:wne="http://schemas.microsoft.com/office/word/2006/wordml" xmlns:wps="http://schemas.microsoft.com/office/word/2010/wordprocessingShape" mc:Ignorable="w14 w15 w16se w16cid wp14">
+  <w:p>
+    <w:pPr>
+      <w:pStyle w:val="Piedepgina"/>
+    </w:pPr>
+  </w:p>
+</w:ftr>
+</file>
+
 <file path=word/footnotes.xml><?xml version="1.0" encoding="utf-8"?>
 <w:footnotes xmlns:wpc="http://schemas.microsoft.com/office/word/2010/wordprocessingCanvas" xmlns:cx="http://schemas.microsoft.com/office/drawing/2014/chartex" xmlns:cx1="http://schemas.microsoft.com/office/drawing/2015/9/8/chartex" xmlns:cx2="http://schemas.microsoft.com/office/drawing/2015/10/21/chartex" xmlns:cx3="http://schemas.microsoft.com/office/drawing/2016/5/9/chartex" xmlns:cx4="http://schemas.microsoft.com/office/drawing/2016/5/10/chartex" xmlns:cx5="http://schemas.microsoft.com/office/drawing/2016/5/11/chartex" xmlns:cx6="http://schemas.microsoft.com/office/drawing/2016/5/12/chartex" xmlns:cx7="http://schemas.microsoft.com/office/drawing/2016/5/13/chartex" xmlns:cx8="http://schemas.microsoft.com/office/drawing/2016/5/14/chartex" xmlns:mc="http://schemas.openxmlformats.org/markup-compatibility/2006" xmlns:aink="http://schemas.microsoft.com/office/drawing/2016/ink" xmlns:am3d="http://schemas.microsoft.com/office/drawing/2017/model3d" xmlns:o="urn:schemas-microsoft-com:office:office" xmlns:r="http://schemas.openxmlformats.org/officeDocument/2006/relationships" xmlns:m="http://schemas.openxmlformats.org/officeDocument/2006/math" xmlns:v="urn:schemas-microsoft-com:vml" xmlns:wp14="http://schemas.microsoft.com/office/word/2010/wordprocessingDrawing" xmlns:wp="http://schemas.openxmlformats.org/drawingml/2006/wordprocessingDrawing" xmlns:w10="urn:schemas-microsoft-com:office:word" xmlns:w="http://schemas.openxmlformats.org/wordprocessingml/2006/main" xmlns:w14="http://schemas.microsoft.com/office/word/2010/wordml" xmlns:w15="http://schemas.microsoft.com/office/word/2012/wordml" xmlns:w16cid="http://schemas.microsoft.com/office/word/2016/wordml/cid" xmlns:w16se="http://schemas.microsoft.com/office/word/2015/wordml/symex" xmlns:wpg="http://schemas.microsoft.com/office/word/2010/wordprocessingGroup" xmlns:wpi="http://schemas.microsoft.com/office/word/2010/wordprocessingInk" xmlns:wne="http://schemas.microsoft.com/office/word/2006/wordml" xmlns:wps="http://schemas.microsoft.com/office/word/2010/wordprocessingShape" mc:Ignorable="w14 w15 w16se w16cid wp14">
   <w:footnote w:type="separator" w:id="-1">
@@ -366,17 +353,28 @@
 <w:hdr xmlns:wpc="http://schemas.microsoft.com/office/word/2010/wordprocessingCanvas" xmlns:cx="http://schemas.microsoft.com/office/drawing/2014/chartex" xmlns:cx1="http://schemas.microsoft.com/office/drawing/2015/9/8/chartex" xmlns:cx2="http://schemas.microsoft.com/office/drawing/2015/10/21/chartex" xmlns:cx3="http://schemas.microsoft.com/office/drawing/2016/5/9/chartex" xmlns:cx4="http://schemas.microsoft.com/office/drawing/2016/5/10/chartex" xmlns:cx5="http://schemas.microsoft.com/office/drawing/2016/5/11/chartex" xmlns:cx6="http://schemas.microsoft.com/office/drawing/2016/5/12/chartex" xmlns:cx7="http://schemas.microsoft.com/office/drawing/2016/5/13/chartex" xmlns:cx8="http://schemas.microsoft.com/office/drawing/2016/5/14/chartex" xmlns:mc="http://schemas.openxmlformats.org/markup-compatibility/2006" xmlns:aink="http://schemas.microsoft.com/office/drawing/2016/ink" xmlns:am3d="http://schemas.microsoft.com/office/drawing/2017/model3d" xmlns:o="urn:schemas-microsoft-com:office:office" xmlns:r="http://schemas.openxmlformats.org/officeDocument/2006/relationships" xmlns:m="http://schemas.openxmlformats.org/officeDocument/2006/math" xmlns:v="urn:schemas-microsoft-com:vml" xmlns:wp14="http://schemas.microsoft.com/office/word/2010/wordprocessingDrawing" xmlns:wp="http://schemas.openxmlformats.org/drawingml/2006/wordprocessingDrawing" xmlns:w10="urn:schemas-microsoft-com:office:word" xmlns:w="http://schemas.openxmlformats.org/wordprocessingml/2006/main" xmlns:w14="http://schemas.microsoft.com/office/word/2010/wordml" xmlns:w15="http://schemas.microsoft.com/office/word/2012/wordml" xmlns:w16cid="http://schemas.microsoft.com/office/word/2016/wordml/cid" xmlns:w16se="http://schemas.microsoft.com/office/word/2015/wordml/symex" xmlns:wpg="http://schemas.microsoft.com/office/word/2010/wordprocessingGroup" xmlns:wpi="http://schemas.microsoft.com/office/word/2010/wordprocessingInk" xmlns:wne="http://schemas.microsoft.com/office/word/2006/wordml" xmlns:wps="http://schemas.microsoft.com/office/word/2010/wordprocessingShape" mc:Ignorable="w14 w15 w16se w16cid wp14">
   <w:p>
     <w:pPr>
-      <w:pStyle w:val="NormalWeb"/>
+      <w:pStyle w:val="Encabezado"/>
+    </w:pPr>
+  </w:p>
+</w:hdr>
+</file>
+
+<file path=word/header2.xml><?xml version="1.0" encoding="utf-8"?>
+<w:hdr xmlns:wpc="http://schemas.microsoft.com/office/word/2010/wordprocessingCanvas" xmlns:cx="http://schemas.microsoft.com/office/drawing/2014/chartex" xmlns:cx1="http://schemas.microsoft.com/office/drawing/2015/9/8/chartex" xmlns:cx2="http://schemas.microsoft.com/office/drawing/2015/10/21/chartex" xmlns:cx3="http://schemas.microsoft.com/office/drawing/2016/5/9/chartex" xmlns:cx4="http://schemas.microsoft.com/office/drawing/2016/5/10/chartex" xmlns:cx5="http://schemas.microsoft.com/office/drawing/2016/5/11/chartex" xmlns:cx6="http://schemas.microsoft.com/office/drawing/2016/5/12/chartex" xmlns:cx7="http://schemas.microsoft.com/office/drawing/2016/5/13/chartex" xmlns:cx8="http://schemas.microsoft.com/office/drawing/2016/5/14/chartex" xmlns:mc="http://schemas.openxmlformats.org/markup-compatibility/2006" xmlns:aink="http://schemas.microsoft.com/office/drawing/2016/ink" xmlns:am3d="http://schemas.microsoft.com/office/drawing/2017/model3d" xmlns:o="urn:schemas-microsoft-com:office:office" xmlns:r="http://schemas.openxmlformats.org/officeDocument/2006/relationships" xmlns:m="http://schemas.openxmlformats.org/officeDocument/2006/math" xmlns:v="urn:schemas-microsoft-com:vml" xmlns:wp14="http://schemas.microsoft.com/office/word/2010/wordprocessingDrawing" xmlns:wp="http://schemas.openxmlformats.org/drawingml/2006/wordprocessingDrawing" xmlns:w10="urn:schemas-microsoft-com:office:word" xmlns:w="http://schemas.openxmlformats.org/wordprocessingml/2006/main" xmlns:w14="http://schemas.microsoft.com/office/word/2010/wordml" xmlns:w15="http://schemas.microsoft.com/office/word/2012/wordml" xmlns:w16cid="http://schemas.microsoft.com/office/word/2016/wordml/cid" xmlns:w16se="http://schemas.microsoft.com/office/word/2015/wordml/symex" xmlns:wpg="http://schemas.microsoft.com/office/word/2010/wordprocessingGroup" xmlns:wpi="http://schemas.microsoft.com/office/word/2010/wordprocessingInk" xmlns:wne="http://schemas.microsoft.com/office/word/2006/wordml" xmlns:wps="http://schemas.microsoft.com/office/word/2010/wordprocessingShape" mc:Ignorable="w14 w15 w16se w16cid wp14">
+  <w:p>
+    <w:pPr>
+      <w:pStyle w:val="Encabezado"/>
     </w:pPr>
     <w:r>
       <w:rPr>
         <w:noProof/>
+        <w:lang w:eastAsia="es-ES"/>
       </w:rPr>
       <w:drawing>
-        <wp:inline distT="0" distB="0" distL="0" distR="0" wp14:anchorId="1018EBAD" wp14:editId="6723F2FE">
-          <wp:extent cx="3246120" cy="1082040"/>
-          <wp:effectExtent l="0" t="0" r="0" b="0"/>
-          <wp:docPr id="1" name="Imagen 1" descr="C:\Users\jose.ordonez\Desktop\TESIS_PhD\usc-logo.png"/>
+        <wp:inline distT="0" distB="0" distL="0" distR="0">
+          <wp:extent cx="2926367" cy="975360"/>
+          <wp:effectExtent l="0" t="0" r="7620" b="0"/>
+          <wp:docPr id="1" name="Imagen 1"/>
           <wp:cNvGraphicFramePr>
             <a:graphicFrameLocks xmlns:a="http://schemas.openxmlformats.org/drawingml/2006/main" noChangeAspect="1"/>
           </wp:cNvGraphicFramePr>
@@ -384,10 +382,8 @@
             <a:graphicData uri="http://schemas.openxmlformats.org/drawingml/2006/picture">
               <pic:pic xmlns:pic="http://schemas.openxmlformats.org/drawingml/2006/picture">
                 <pic:nvPicPr>
-                  <pic:cNvPr id="0" name="Picture 1" descr="C:\Users\jose.ordonez\Desktop\TESIS_PhD\usc-logo.png"/>
-                  <pic:cNvPicPr>
-                    <a:picLocks noChangeAspect="1" noChangeArrowheads="1"/>
-                  </pic:cNvPicPr>
+                  <pic:cNvPr id="1" name="usc-logo.png"/>
+                  <pic:cNvPicPr/>
                 </pic:nvPicPr>
                 <pic:blipFill>
                   <a:blip r:embed="rId1">
@@ -397,23 +393,18 @@
                       </a:ext>
                     </a:extLst>
                   </a:blip>
-                  <a:srcRect/>
                   <a:stretch>
                     <a:fillRect/>
                   </a:stretch>
                 </pic:blipFill>
-                <pic:spPr bwMode="auto">
+                <pic:spPr>
                   <a:xfrm>
                     <a:off x="0" y="0"/>
-                    <a:ext cx="3246120" cy="1082040"/>
+                    <a:ext cx="2948236" cy="982649"/>
                   </a:xfrm>
                   <a:prstGeom prst="rect">
                     <a:avLst/>
                   </a:prstGeom>
-                  <a:noFill/>
-                  <a:ln>
-                    <a:noFill/>
-                  </a:ln>
                 </pic:spPr>
               </pic:pic>
             </a:graphicData>
@@ -421,7 +412,14 @@
         </wp:inline>
       </w:drawing>
     </w:r>
+    <w:bookmarkStart w:id="0" w:name="_GoBack"/>
+    <w:bookmarkEnd w:id="0"/>
   </w:p>
+</w:hdr>
+</file>
+
+<file path=word/header3.xml><?xml version="1.0" encoding="utf-8"?>
+<w:hdr xmlns:wpc="http://schemas.microsoft.com/office/word/2010/wordprocessingCanvas" xmlns:cx="http://schemas.microsoft.com/office/drawing/2014/chartex" xmlns:cx1="http://schemas.microsoft.com/office/drawing/2015/9/8/chartex" xmlns:cx2="http://schemas.microsoft.com/office/drawing/2015/10/21/chartex" xmlns:cx3="http://schemas.microsoft.com/office/drawing/2016/5/9/chartex" xmlns:cx4="http://schemas.microsoft.com/office/drawing/2016/5/10/chartex" xmlns:cx5="http://schemas.microsoft.com/office/drawing/2016/5/11/chartex" xmlns:cx6="http://schemas.microsoft.com/office/drawing/2016/5/12/chartex" xmlns:cx7="http://schemas.microsoft.com/office/drawing/2016/5/13/chartex" xmlns:cx8="http://schemas.microsoft.com/office/drawing/2016/5/14/chartex" xmlns:mc="http://schemas.openxmlformats.org/markup-compatibility/2006" xmlns:aink="http://schemas.microsoft.com/office/drawing/2016/ink" xmlns:am3d="http://schemas.microsoft.com/office/drawing/2017/model3d" xmlns:o="urn:schemas-microsoft-com:office:office" xmlns:r="http://schemas.openxmlformats.org/officeDocument/2006/relationships" xmlns:m="http://schemas.openxmlformats.org/officeDocument/2006/math" xmlns:v="urn:schemas-microsoft-com:vml" xmlns:wp14="http://schemas.microsoft.com/office/word/2010/wordprocessingDrawing" xmlns:wp="http://schemas.openxmlformats.org/drawingml/2006/wordprocessingDrawing" xmlns:w10="urn:schemas-microsoft-com:office:word" xmlns:w="http://schemas.openxmlformats.org/wordprocessingml/2006/main" xmlns:w14="http://schemas.microsoft.com/office/word/2010/wordml" xmlns:w15="http://schemas.microsoft.com/office/word/2012/wordml" xmlns:w16cid="http://schemas.microsoft.com/office/word/2016/wordml/cid" xmlns:w16se="http://schemas.microsoft.com/office/word/2015/wordml/symex" xmlns:wpg="http://schemas.microsoft.com/office/word/2010/wordprocessingGroup" xmlns:wpi="http://schemas.microsoft.com/office/word/2010/wordprocessingInk" xmlns:wne="http://schemas.microsoft.com/office/word/2006/wordml" xmlns:wps="http://schemas.microsoft.com/office/word/2010/wordprocessingShape" mc:Ignorable="w14 w15 w16se w16cid wp14">
   <w:p>
     <w:pPr>
       <w:pStyle w:val="Encabezado"/>
@@ -929,23 +927,6 @@
     <w:uiPriority w:val="99"/>
     <w:rsid w:val="00A1592A"/>
   </w:style>
-  <w:style w:type="paragraph" w:styleId="NormalWeb">
-    <w:name w:val="Normal (Web)"/>
-    <w:basedOn w:val="Normal"/>
-    <w:uiPriority w:val="99"/>
-    <w:semiHidden/>
-    <w:unhideWhenUsed/>
-    <w:rsid w:val="003D688A"/>
-    <w:pPr>
-      <w:spacing w:before="100" w:beforeAutospacing="1" w:after="100" w:afterAutospacing="1" w:line="240" w:lineRule="auto"/>
-    </w:pPr>
-    <w:rPr>
-      <w:rFonts w:ascii="Times New Roman" w:eastAsia="Times New Roman" w:hAnsi="Times New Roman" w:cs="Times New Roman"/>
-      <w:sz w:val="24"/>
-      <w:szCs w:val="24"/>
-      <w:lang w:val="es-EC" w:eastAsia="es-EC"/>
-    </w:rPr>
-  </w:style>
 </w:styles>
 </file>
 

</xml_diff>

<commit_message>
Sincroniza correcciones finales previas al deposito
</commit_message>
<xml_diff>
--- a/docs/edius/modelos/portada_interna_usc.docx
+++ b/docs/edius/modelos/portada_interna_usc.docx
@@ -36,18 +36,17 @@
           <w:szCs w:val="48"/>
         </w:rPr>
       </w:pPr>
-    </w:p>
-    <w:p>
-      <w:pPr>
-        <w:spacing w:line="240" w:lineRule="auto"/>
-        <w:jc w:val="center"/>
+      <w:r>
         <w:rPr>
           <w:rFonts w:ascii="Lucida" w:hAnsi="Lucida"/>
           <w:smallCaps/>
           <w:sz w:val="48"/>
           <w:szCs w:val="48"/>
         </w:rPr>
-      </w:pPr>
+        <w:t xml:space="preserve">tesis </w:t>
+      </w:r>
+      <w:bookmarkStart w:id="0" w:name="_GoBack"/>
+      <w:bookmarkEnd w:id="0"/>
       <w:r>
         <w:rPr>
           <w:rFonts w:ascii="Lucida" w:hAnsi="Lucida"/>
@@ -55,7 +54,16 @@
           <w:sz w:val="48"/>
           <w:szCs w:val="48"/>
         </w:rPr>
-        <w:t>tesis de doctorado</w:t>
+        <w:t>doctora</w:t>
+      </w:r>
+      <w:r>
+        <w:rPr>
+          <w:rFonts w:ascii="Lucida" w:hAnsi="Lucida"/>
+          <w:smallCaps/>
+          <w:sz w:val="48"/>
+          <w:szCs w:val="48"/>
+        </w:rPr>
+        <w:t>l</w:t>
       </w:r>
     </w:p>
     <w:p>
@@ -107,7 +115,109 @@
           <w:sz w:val="40"/>
           <w:szCs w:val="40"/>
         </w:rPr>
-        <w:t>José Vicente Ordóñez Yaguache</w:t>
+        <w:t xml:space="preserve">José Vicente Ordóñez </w:t>
+      </w:r>
+      <w:proofErr w:type="spellStart"/>
+      <w:r>
+        <w:rPr>
+          <w:rFonts w:ascii="Lucida" w:hAnsi="Lucida"/>
+          <w:sz w:val="40"/>
+          <w:szCs w:val="40"/>
+        </w:rPr>
+        <w:t>Yaguache</w:t>
+      </w:r>
+      <w:proofErr w:type="spellEnd"/>
+    </w:p>
+    <w:p>
+      <w:pPr>
+        <w:spacing w:after="0" w:line="240" w:lineRule="auto"/>
+        <w:jc w:val="center"/>
+        <w:rPr>
+          <w:rFonts w:ascii="Lucida" w:hAnsi="Lucida"/>
+          <w:sz w:val="28"/>
+          <w:szCs w:val="28"/>
+        </w:rPr>
+      </w:pPr>
+      <w:r>
+        <w:rPr>
+          <w:rFonts w:ascii="Lucida" w:hAnsi="Lucida"/>
+          <w:b/>
+          <w:sz w:val="28"/>
+          <w:szCs w:val="28"/>
+        </w:rPr>
+        <w:t>Directores</w:t>
+      </w:r>
+      <w:r>
+        <w:rPr>
+          <w:rFonts w:ascii="Lucida" w:hAnsi="Lucida"/>
+          <w:sz w:val="28"/>
+          <w:szCs w:val="28"/>
+        </w:rPr>
+        <w:t xml:space="preserve">: Eduardo </w:t>
+      </w:r>
+      <w:proofErr w:type="spellStart"/>
+      <w:r>
+        <w:rPr>
+          <w:rFonts w:ascii="Lucida" w:hAnsi="Lucida"/>
+          <w:sz w:val="28"/>
+          <w:szCs w:val="28"/>
+        </w:rPr>
+        <w:t>Corbelle</w:t>
+      </w:r>
+      <w:proofErr w:type="spellEnd"/>
+      <w:r>
+        <w:rPr>
+          <w:rFonts w:ascii="Lucida" w:hAnsi="Lucida"/>
+          <w:sz w:val="28"/>
+          <w:szCs w:val="28"/>
+        </w:rPr>
+        <w:t xml:space="preserve"> Rico, Edelmiro López Iglesias</w:t>
+      </w:r>
+    </w:p>
+    <w:p>
+      <w:pPr>
+        <w:spacing w:after="0" w:line="240" w:lineRule="auto"/>
+        <w:jc w:val="center"/>
+        <w:rPr>
+          <w:rFonts w:ascii="Lucida" w:hAnsi="Lucida"/>
+          <w:sz w:val="28"/>
+          <w:szCs w:val="28"/>
+        </w:rPr>
+      </w:pPr>
+      <w:r>
+        <w:rPr>
+          <w:rFonts w:ascii="Lucida" w:hAnsi="Lucida"/>
+          <w:b/>
+          <w:sz w:val="28"/>
+          <w:szCs w:val="28"/>
+        </w:rPr>
+        <w:t>Tutor</w:t>
+      </w:r>
+      <w:r>
+        <w:rPr>
+          <w:rFonts w:ascii="Lucida" w:hAnsi="Lucida"/>
+          <w:sz w:val="28"/>
+          <w:szCs w:val="28"/>
+        </w:rPr>
+        <w:t xml:space="preserve">: Eduardo </w:t>
+      </w:r>
+      <w:proofErr w:type="spellStart"/>
+      <w:r>
+        <w:rPr>
+          <w:rFonts w:ascii="Lucida" w:hAnsi="Lucida"/>
+          <w:sz w:val="28"/>
+          <w:szCs w:val="28"/>
+        </w:rPr>
+        <w:t>Corbelle</w:t>
+      </w:r>
+      <w:proofErr w:type="spellEnd"/>
+      <w:r>
+        <w:rPr>
+          <w:rFonts w:ascii="Lucida" w:hAnsi="Lucida"/>
+          <w:sz w:val="28"/>
+          <w:szCs w:val="28"/>
+        </w:rPr>
+        <w:t xml:space="preserve"> Rico</w:t>
       </w:r>
     </w:p>
     <w:p>
@@ -412,8 +522,6 @@
         </wp:inline>
       </w:drawing>
     </w:r>
-    <w:bookmarkStart w:id="0" w:name="_GoBack"/>
-    <w:bookmarkEnd w:id="0"/>
   </w:p>
 </w:hdr>
 </file>
@@ -600,7 +708,7 @@
     <w:lsdException w:name="Table Web 2" w:semiHidden="1" w:unhideWhenUsed="1"/>
     <w:lsdException w:name="Table Web 3" w:semiHidden="1" w:unhideWhenUsed="1"/>
     <w:lsdException w:name="Balloon Text" w:semiHidden="1" w:unhideWhenUsed="1"/>
-    <w:lsdException w:name="Table Grid" w:semiHidden="1" w:uiPriority="59" w:unhideWhenUsed="1"/>
+    <w:lsdException w:name="Table Grid" w:uiPriority="59"/>
     <w:lsdException w:name="Table Theme" w:semiHidden="1" w:unhideWhenUsed="1"/>
     <w:lsdException w:name="Placeholder Text" w:semiHidden="1"/>
     <w:lsdException w:name="No Spacing" w:uiPriority="1" w:qFormat="1"/>

</xml_diff>